<commit_message>
Ajoute les chiffres du rapport de la Cour des comptes sur le commerce de proximité
Le rapport « La politique de l'État en faveur du commerce de proximité »
(29/09/2023) n'a pas pu être ouvert : ses chiffres sont repris de
synthèses et notés comme tels. Précise aussi la part de projets
d'entrées de ville initiés par des acteurs privés (65 à 66 %).

Co-Authored-By: Claude Opus 5.5 <noreply@anthropic.com>
Claude-Session: https://claude.ai/code/session_01C7XiPcXpETUWAHMH28sD58
</commit_message>
<xml_diff>
--- a/etat_de_l_art/etat_de_l_art_zones_commerciales_centres_villes_QPV.docx
+++ b/etat_de_l_art/etat_de_l_art_zones_commerciales_centres_villes_QPV.docx
@@ -1375,7 +1375,7 @@
                 <w:sz w:val="17"/>
                 <w:szCs w:val="17"/>
               </w:rPr>
-              <w:t xml:space="preserve">Commerce de proximité, politique de la ville, Action Cœur de Ville</w:t>
+              <w:t xml:space="preserve">Politique de l'État en faveur du commerce de proximité, politique de la ville, Action Cœur de Ville</w:t>
             </w:r>
           </w:p>
         </w:tc>
@@ -2926,7 +2926,7 @@
           <w:bCs/>
           <w:color w:val="003087"/>
         </w:rPr>
-        <w:t xml:space="preserve">Cour des comptes, synthèse sur le commerce de proximité (2023)</w:t>
+        <w:t xml:space="preserve">Cour des comptes, « La politique de l'État en faveur du commerce de proximité » (2023)</w:t>
       </w:r>
       <w:r>
         <w:rPr>
@@ -2936,13 +2936,31 @@
         </w:rPr>
         <w:t xml:space="preserve">  [S23]</w:t>
       </w:r>
+      <w:r>
+        <w:rPr>
+          <w:i/>
+          <w:iCs/>
+          <w:color w:val="595959"/>
+          <w:sz w:val="18"/>
+          <w:szCs w:val="18"/>
+        </w:rPr>
+        <w:t xml:space="preserve">  —  Champ : commerce de proximité, 2017-2022</w:t>
+      </w:r>
     </w:p>
     <w:p>
       <w:pPr>
         <w:spacing w:after="120" w:line="276"/>
       </w:pPr>
       <w:r>
-        <w:t xml:space="preserve">La part de marché du commerce alimentaire de proximité passe de 22 % en 1993 à 17 % en 2017, au profit de la grande distribution. La Cour relève aussi que l'État a cessé en 2017 les aides directes aux petits commerces au profit de programmes intégrés (Action Cœur de Ville, Petites villes de demain), et pointe un manque de coordination et de suivi.</w:t>
+        <w:t xml:space="preserve">La Cour décrit un secteur d'environ 700 000 entreprises et 1,1 million d'emplois, salariés et non salariés ; 68 % des entreprises n'ont aucun salarié. La part de marché du commerce alimentaire spécialisé passe de 22 % en 1993 à 17 % en 2017, puis remonte à 20 % en 2021, avec l'essor des supérettes. Les ventes en ligne représentent 12,5 % des ventes du commerce de détail en 2022. Selon les synthèses du rapport, la vacance commerciale en centre-ville passe de 7 % en 2012 à 12,3 % en 2020, et près de 40 villes dépassent 20 %.</w:t>
+      </w:r>
+    </w:p>
+    <w:p>
+      <w:pPr>
+        <w:spacing w:after="120" w:line="276"/>
+      </w:pPr>
+      <w:r>
+        <w:t xml:space="preserve">Environ 500 millions d'euros d'aides ont été attribués au secteur entre 2018 et 2022. L'État a cessé les aides économiques directes aux petits commerces au profit de programmes territoriaux (Action Cœur de Ville, Petites villes de demain) ; les crédits du FISAC sont passés de 80 millions d'euros en 2007 à 16 millions en 2018 avant sa suppression. La Cour pointe une profusion de dispositifs aux résultats inégaux, une coordination insuffisante entre l'État et les collectivités et un manque d'indicateurs de suivi. Le rapport n'a pas pu être ouvert directement : ces chiffres proviennent de synthèses et sont à vérifier.</w:t>
       </w:r>
     </w:p>
     <w:p>
@@ -4251,7 +4269,7 @@
         <w:spacing w:after="120" w:line="276"/>
       </w:pPr>
       <w:r>
-        <w:t xml:space="preserve">Le baromètre recense 437 projets de transformation d'entrées de ville sur 8 606 hectares ; 56 % sont au stade de l'intention et 1 % sont achevés ; 66 % sont portés par des acteurs privés. Dans le sondage Quorum, 93 % des élus jugent les entrées de ville stratégiques ; 53 % citent le financement comme premier frein et 43 % la réglementation. L'équipement de la personne aurait perdu près de 14 000 établissements en dix ans (revue </w:t>
+        <w:t xml:space="preserve">Le baromètre recense 437 projets de transformation d'entrées de ville sur 8 606 hectares ; 56 % sont au stade de l'intention et 1 % sont achevés ; environ deux tiers sont initiés par des acteurs privés (65 % ou 66 % selon les pages), un tiers par des acteurs publics. Dans le sondage Quorum, 93 % des élus jugent les entrées de ville stratégiques ; 53 % citent le financement comme premier frein et 43 % la réglementation. L'équipement de la personne aurait perdu près de 14 000 établissements en dix ans (revue </w:t>
       </w:r>
       <w:r>
         <w:rPr>
@@ -4549,7 +4567,7 @@
         </w:rPr>
         <w:t xml:space="preserve"> </w:t>
       </w:r>
-      <w:hyperlink w:history="1" r:id="rId6qp_krrwoykpphz1utx4w">
+      <w:hyperlink w:history="1" r:id="rIdum1usc8jzi7whfvjp6azz">
         <w:r>
           <w:rPr>
             <w:rStyle w:val="Hyperlink"/>
@@ -4603,7 +4621,7 @@
         </w:rPr>
         <w:t xml:space="preserve"> </w:t>
       </w:r>
-      <w:hyperlink w:history="1" r:id="rIdgwmde95gorvknnwk1pijx">
+      <w:hyperlink w:history="1" r:id="rId2mjx7itpcy69ad8yhleef">
         <w:r>
           <w:rPr>
             <w:rStyle w:val="Hyperlink"/>
@@ -4657,7 +4675,7 @@
         </w:rPr>
         <w:t xml:space="preserve"> </w:t>
       </w:r>
-      <w:hyperlink w:history="1" r:id="rIdrb57ubjd7ienq759wycon">
+      <w:hyperlink w:history="1" r:id="rId1jcjy6ssupmh_fk3k9zrz">
         <w:r>
           <w:rPr>
             <w:rStyle w:val="Hyperlink"/>
@@ -4711,7 +4729,7 @@
         </w:rPr>
         <w:t xml:space="preserve"> </w:t>
       </w:r>
-      <w:hyperlink w:history="1" r:id="rId7l6c7knssmgy9jrm3rdbx">
+      <w:hyperlink w:history="1" r:id="rIdg96olbtinjorzdq_nvdau">
         <w:r>
           <w:rPr>
             <w:rStyle w:val="Hyperlink"/>
@@ -4765,7 +4783,7 @@
         </w:rPr>
         <w:t xml:space="preserve"> </w:t>
       </w:r>
-      <w:hyperlink w:history="1" r:id="rIdfckk3fugstlp7f7hnktvu">
+      <w:hyperlink w:history="1" r:id="rIdcou1m8aktgwtvluxnraww">
         <w:r>
           <w:rPr>
             <w:rStyle w:val="Hyperlink"/>
@@ -4864,7 +4882,7 @@
         </w:rPr>
         <w:t xml:space="preserve"> </w:t>
       </w:r>
-      <w:hyperlink w:history="1" r:id="rIdzsfcdtm3eown1qih-1stk">
+      <w:hyperlink w:history="1" r:id="rIdproiybrppl_m2upvuud6u">
         <w:r>
           <w:rPr>
             <w:rStyle w:val="Hyperlink"/>
@@ -4918,7 +4936,7 @@
         </w:rPr>
         <w:t xml:space="preserve"> </w:t>
       </w:r>
-      <w:hyperlink w:history="1" r:id="rId8guwoncmsidgqmlyrojc_">
+      <w:hyperlink w:history="1" r:id="rIdoes1hnclkdo_-ckwygfiz">
         <w:r>
           <w:rPr>
             <w:rStyle w:val="Hyperlink"/>
@@ -4956,14 +4974,14 @@
           <w:sz w:val="19"/>
           <w:szCs w:val="19"/>
         </w:rPr>
-        <w:t xml:space="preserve">Synthèse sur les politiques publiques en faveur du commerce de proximité (intitulé exact à vérifier)</w:t>
-      </w:r>
-      <w:r>
-        <w:rPr>
-          <w:sz w:val="19"/>
-          <w:szCs w:val="19"/>
-        </w:rPr>
-        <w:t xml:space="preserve">, 09/2023.</w:t>
+        <w:t xml:space="preserve">La politique de l'État en faveur du commerce de proximité, rapport public thématique (période 2017-2022)</w:t>
+      </w:r>
+      <w:r>
+        <w:rPr>
+          <w:sz w:val="19"/>
+          <w:szCs w:val="19"/>
+        </w:rPr>
+        <w:t xml:space="preserve">, 29/09/2023.</w:t>
       </w:r>
       <w:r>
         <w:rPr>
@@ -4972,14 +4990,14 @@
         </w:rPr>
         <w:t xml:space="preserve"> </w:t>
       </w:r>
-      <w:hyperlink w:history="1" r:id="rId8dy9tdgiytugm3dqyxdsi">
+      <w:hyperlink w:history="1" r:id="rIdyy7ohgabdjakvxr2ihgal">
         <w:r>
           <w:rPr>
             <w:rStyle w:val="Hyperlink"/>
             <w:sz w:val="17"/>
             <w:szCs w:val="17"/>
           </w:rPr>
-          <w:t xml:space="preserve">https://www.ccomptes.fr/sites/default/files/2023-10/20230929-synthese-politiques-publiques-commerce-proximite.pdf</w:t>
+          <w:t xml:space="preserve">https://www.ccomptes.fr/sites/default/files/2023-10/20230929-politiques-publiques-commerce-proximite.pdf</w:t>
         </w:r>
       </w:hyperlink>
     </w:p>
@@ -5026,7 +5044,7 @@
         </w:rPr>
         <w:t xml:space="preserve"> </w:t>
       </w:r>
-      <w:hyperlink w:history="1" r:id="rIdjlxtgm1ywcmqzwbpcghrt">
+      <w:hyperlink w:history="1" r:id="rId0kyr5t3p247ejt8mxyqjk">
         <w:r>
           <w:rPr>
             <w:rStyle w:val="Hyperlink"/>
@@ -5080,7 +5098,7 @@
         </w:rPr>
         <w:t xml:space="preserve"> </w:t>
       </w:r>
-      <w:hyperlink w:history="1" r:id="rIdutmxfostdwmhmkcrr0iyh">
+      <w:hyperlink w:history="1" r:id="rIdxcgy42_tizyhkgypab61e">
         <w:r>
           <w:rPr>
             <w:rStyle w:val="Hyperlink"/>
@@ -5134,7 +5152,7 @@
         </w:rPr>
         <w:t xml:space="preserve"> </w:t>
       </w:r>
-      <w:hyperlink w:history="1" r:id="rIdg6iywl4ked7qrmlzeexvh">
+      <w:hyperlink w:history="1" r:id="rIdyjfbq1mrmoororcsztfx4">
         <w:r>
           <w:rPr>
             <w:rStyle w:val="Hyperlink"/>
@@ -5188,7 +5206,7 @@
         </w:rPr>
         <w:t xml:space="preserve"> </w:t>
       </w:r>
-      <w:hyperlink w:history="1" r:id="rIdn_gwuftjwuohfbq1kh7ii">
+      <w:hyperlink w:history="1" r:id="rId-y6wc_l5tvllffzwftcaw">
         <w:r>
           <w:rPr>
             <w:rStyle w:val="Hyperlink"/>
@@ -5242,7 +5260,7 @@
         </w:rPr>
         <w:t xml:space="preserve"> </w:t>
       </w:r>
-      <w:hyperlink w:history="1" r:id="rIdtd1wvdnrowlkmxnple-t1">
+      <w:hyperlink w:history="1" r:id="rIdulnyxkl3ivubmsiyqioaa">
         <w:r>
           <w:rPr>
             <w:rStyle w:val="Hyperlink"/>
@@ -5296,7 +5314,7 @@
         </w:rPr>
         <w:t xml:space="preserve"> </w:t>
       </w:r>
-      <w:hyperlink w:history="1" r:id="rIddjkwcams3dcw0oanmdx2h">
+      <w:hyperlink w:history="1" r:id="rIdfcswqs1srtwxzg33qetkh">
         <w:r>
           <w:rPr>
             <w:rStyle w:val="Hyperlink"/>
@@ -5350,7 +5368,7 @@
         </w:rPr>
         <w:t xml:space="preserve"> </w:t>
       </w:r>
-      <w:hyperlink w:history="1" r:id="rIdalj-z0nnj4t_dbrhdi0k0">
+      <w:hyperlink w:history="1" r:id="rIdv9bhf78otol_1h0obmjcd">
         <w:r>
           <w:rPr>
             <w:rStyle w:val="Hyperlink"/>
@@ -5404,7 +5422,7 @@
         </w:rPr>
         <w:t xml:space="preserve"> </w:t>
       </w:r>
-      <w:hyperlink w:history="1" r:id="rIdunmapvqqsixunvntpvue4">
+      <w:hyperlink w:history="1" r:id="rId3omj72afmjcmowuaekjne">
         <w:r>
           <w:rPr>
             <w:rStyle w:val="Hyperlink"/>
@@ -5458,7 +5476,7 @@
         </w:rPr>
         <w:t xml:space="preserve"> </w:t>
       </w:r>
-      <w:hyperlink w:history="1" r:id="rIdli-zn-v5n8-8_k0mkmubi">
+      <w:hyperlink w:history="1" r:id="rId_kkjmyfpfrlt1erpxyxwn">
         <w:r>
           <w:rPr>
             <w:rStyle w:val="Hyperlink"/>
@@ -5520,7 +5538,7 @@
         </w:rPr>
         <w:t xml:space="preserve"> </w:t>
       </w:r>
-      <w:hyperlink w:history="1" r:id="rIdbfs2g-_ysz43sdgvuzbep">
+      <w:hyperlink w:history="1" r:id="rIdgsvlyvu2hqkmecr3j538v">
         <w:r>
           <w:rPr>
             <w:rStyle w:val="Hyperlink"/>
@@ -5574,7 +5592,7 @@
         </w:rPr>
         <w:t xml:space="preserve"> </w:t>
       </w:r>
-      <w:hyperlink w:history="1" r:id="rIdapypgguevxhsxvecon4qw">
+      <w:hyperlink w:history="1" r:id="rId-rlikggtbdliiwkvhlbjo">
         <w:r>
           <w:rPr>
             <w:rStyle w:val="Hyperlink"/>
@@ -5628,7 +5646,7 @@
         </w:rPr>
         <w:t xml:space="preserve"> </w:t>
       </w:r>
-      <w:hyperlink w:history="1" r:id="rIdgwjmxfqzcvjxuxt_s8l5l">
+      <w:hyperlink w:history="1" r:id="rIdxkjgfihveps_ckmpkesu7">
         <w:r>
           <w:rPr>
             <w:rStyle w:val="Hyperlink"/>
@@ -5682,7 +5700,7 @@
         </w:rPr>
         <w:t xml:space="preserve"> </w:t>
       </w:r>
-      <w:hyperlink w:history="1" r:id="rIdb2ehugj_kamvu-tyvupqe">
+      <w:hyperlink w:history="1" r:id="rIdftmla2pgm1kh31zg9tcba">
         <w:r>
           <w:rPr>
             <w:rStyle w:val="Hyperlink"/>
@@ -5736,7 +5754,7 @@
         </w:rPr>
         <w:t xml:space="preserve"> </w:t>
       </w:r>
-      <w:hyperlink w:history="1" r:id="rId46-u6qp0280c-cofn_pmi">
+      <w:hyperlink w:history="1" r:id="rIdx0o9rdvnm5ztllmxqfkiq">
         <w:r>
           <w:rPr>
             <w:rStyle w:val="Hyperlink"/>
@@ -5790,7 +5808,7 @@
         </w:rPr>
         <w:t xml:space="preserve"> </w:t>
       </w:r>
-      <w:hyperlink w:history="1" r:id="rIdeflhtzu4yw-qc9vduvj4l">
+      <w:hyperlink w:history="1" r:id="rIdre4yvperu3cxgab3dnibo">
         <w:r>
           <w:rPr>
             <w:rStyle w:val="Hyperlink"/>
@@ -5844,7 +5862,7 @@
         </w:rPr>
         <w:t xml:space="preserve"> </w:t>
       </w:r>
-      <w:hyperlink w:history="1" r:id="rIdurydwb_usdbcj7vlwwvwn">
+      <w:hyperlink w:history="1" r:id="rIduducp7l5tpztdo5brgovx">
         <w:r>
           <w:rPr>
             <w:rStyle w:val="Hyperlink"/>
@@ -5898,7 +5916,7 @@
         </w:rPr>
         <w:t xml:space="preserve"> </w:t>
       </w:r>
-      <w:hyperlink w:history="1" r:id="rIdzrusuzguqexbnlbenbhrw">
+      <w:hyperlink w:history="1" r:id="rIdmqrb7s58zf1ewtjfdaf26">
         <w:r>
           <w:rPr>
             <w:rStyle w:val="Hyperlink"/>
@@ -5952,7 +5970,7 @@
         </w:rPr>
         <w:t xml:space="preserve"> </w:t>
       </w:r>
-      <w:hyperlink w:history="1" r:id="rIdmoy4xylngznibdoz14sqg">
+      <w:hyperlink w:history="1" r:id="rIdyq0pn3zmcr1grdz4mtur1">
         <w:r>
           <w:rPr>
             <w:rStyle w:val="Hyperlink"/>
@@ -6006,7 +6024,7 @@
         </w:rPr>
         <w:t xml:space="preserve"> </w:t>
       </w:r>
-      <w:hyperlink w:history="1" r:id="rIdu6knofuos-4ezc9mfwnrh">
+      <w:hyperlink w:history="1" r:id="rIdld2ysjxp6e3u-dmwel4lp">
         <w:r>
           <w:rPr>
             <w:rStyle w:val="Hyperlink"/>
@@ -6060,7 +6078,7 @@
         </w:rPr>
         <w:t xml:space="preserve"> </w:t>
       </w:r>
-      <w:hyperlink w:history="1" r:id="rIdj-0kmbtwdo8tsnf_qtrhu">
+      <w:hyperlink w:history="1" r:id="rIdmyrofaktsnzveujce9mqa">
         <w:r>
           <w:rPr>
             <w:rStyle w:val="Hyperlink"/>
@@ -6114,7 +6132,7 @@
         </w:rPr>
         <w:t xml:space="preserve"> </w:t>
       </w:r>
-      <w:hyperlink w:history="1" r:id="rIdlnpp8t6lfuq8tieaadxl7">
+      <w:hyperlink w:history="1" r:id="rIdgprdc0n1_atrklbqjjkgc">
         <w:r>
           <w:rPr>
             <w:rStyle w:val="Hyperlink"/>
@@ -6168,7 +6186,7 @@
         </w:rPr>
         <w:t xml:space="preserve"> </w:t>
       </w:r>
-      <w:hyperlink w:history="1" r:id="rIdrwdiweewbrzemcpk3mxgv">
+      <w:hyperlink w:history="1" r:id="rIdfweswv7zdoenexvcz9tkv">
         <w:r>
           <w:rPr>
             <w:rStyle w:val="Hyperlink"/>
@@ -6222,7 +6240,7 @@
         </w:rPr>
         <w:t xml:space="preserve"> </w:t>
       </w:r>
-      <w:hyperlink w:history="1" r:id="rId4jsrnfoscykgt9znbatjt">
+      <w:hyperlink w:history="1" r:id="rIdodsq-yjbnlzrlao_awqyk">
         <w:r>
           <w:rPr>
             <w:rStyle w:val="Hyperlink"/>
@@ -6276,7 +6294,7 @@
         </w:rPr>
         <w:t xml:space="preserve"> </w:t>
       </w:r>
-      <w:hyperlink w:history="1" r:id="rIdyk06je7u_juc7ycnsk66b">
+      <w:hyperlink w:history="1" r:id="rIdmb7pcqtx--7mkas8yy7pw">
         <w:r>
           <w:rPr>
             <w:rStyle w:val="Hyperlink"/>
@@ -6330,7 +6348,7 @@
         </w:rPr>
         <w:t xml:space="preserve"> </w:t>
       </w:r>
-      <w:hyperlink w:history="1" r:id="rIddxxykimrg4oh9iwwcqe_s">
+      <w:hyperlink w:history="1" r:id="rId2e4px8xw2nbcbdyc93ffc">
         <w:r>
           <w:rPr>
             <w:rStyle w:val="Hyperlink"/>
@@ -6392,7 +6410,7 @@
         </w:rPr>
         <w:t xml:space="preserve"> </w:t>
       </w:r>
-      <w:hyperlink w:history="1" r:id="rIdv_-aq6inc-cfh34uxvqya">
+      <w:hyperlink w:history="1" r:id="rIdeosyj_bdg_nre5xwl8qgw">
         <w:r>
           <w:rPr>
             <w:rStyle w:val="Hyperlink"/>
@@ -6454,7 +6472,7 @@
         </w:rPr>
         <w:t xml:space="preserve"> </w:t>
       </w:r>
-      <w:hyperlink w:history="1" r:id="rId-pt8wiismqo4cajs-ww64">
+      <w:hyperlink w:history="1" r:id="rIdufidw5-4bkst_mhkmz7ns">
         <w:r>
           <w:rPr>
             <w:rStyle w:val="Hyperlink"/>
@@ -6590,7 +6608,7 @@
         </w:rPr>
         <w:t xml:space="preserve"> </w:t>
       </w:r>
-      <w:hyperlink w:history="1" r:id="rId6lchlelaq90rjryg9xpgv">
+      <w:hyperlink w:history="1" r:id="rIdcjq7phjt9qljzetykbbu7">
         <w:r>
           <w:rPr>
             <w:rStyle w:val="Hyperlink"/>
@@ -6644,7 +6662,7 @@
         </w:rPr>
         <w:t xml:space="preserve"> </w:t>
       </w:r>
-      <w:hyperlink w:history="1" r:id="rIdatnx4kddrrsuvrqezjrm7">
+      <w:hyperlink w:history="1" r:id="rIdpkcbroq4_prcj-hlll5cz">
         <w:r>
           <w:rPr>
             <w:rStyle w:val="Hyperlink"/>
@@ -6735,7 +6753,7 @@
         </w:rPr>
         <w:t xml:space="preserve"> </w:t>
       </w:r>
-      <w:hyperlink w:history="1" r:id="rIdr8ao-4wxcvdkkmgiwmqv0">
+      <w:hyperlink w:history="1" r:id="rIddmutwwbei4g2nsjcqdzuk">
         <w:r>
           <w:rPr>
             <w:rStyle w:val="Hyperlink"/>
@@ -6789,7 +6807,7 @@
         </w:rPr>
         <w:t xml:space="preserve"> </w:t>
       </w:r>
-      <w:hyperlink w:history="1" r:id="rIdgc-wwu0z06ymfobbgovzq">
+      <w:hyperlink w:history="1" r:id="rId54utamv9bisgvfiiouhx5">
         <w:r>
           <w:rPr>
             <w:rStyle w:val="Hyperlink"/>
@@ -6851,7 +6869,7 @@
         </w:rPr>
         <w:t xml:space="preserve"> </w:t>
       </w:r>
-      <w:hyperlink w:history="1" r:id="rIdq3sovgkvfyzz1ngyqfwyy">
+      <w:hyperlink w:history="1" r:id="rId3ruls6nmqawbhuyeoibbu">
         <w:r>
           <w:rPr>
             <w:rStyle w:val="Hyperlink"/>
@@ -6905,7 +6923,7 @@
         </w:rPr>
         <w:t xml:space="preserve"> </w:t>
       </w:r>
-      <w:hyperlink w:history="1" r:id="rIdusg-osthy_7lv-zczu2dq">
+      <w:hyperlink w:history="1" r:id="rId5osqfxqrzpk1jdvyi_quc">
         <w:r>
           <w:rPr>
             <w:rStyle w:val="Hyperlink"/>
@@ -6959,7 +6977,7 @@
         </w:rPr>
         <w:t xml:space="preserve"> </w:t>
       </w:r>
-      <w:hyperlink w:history="1" r:id="rIdpezxltvel0_7lv2rfn6on">
+      <w:hyperlink w:history="1" r:id="rIdsvwivj26wvho5nvpbwya8">
         <w:r>
           <w:rPr>
             <w:rStyle w:val="Hyperlink"/>
@@ -7013,7 +7031,7 @@
         </w:rPr>
         <w:t xml:space="preserve"> </w:t>
       </w:r>
-      <w:hyperlink w:history="1" r:id="rIdpmqfg3hd-sr6cfi4azolz">
+      <w:hyperlink w:history="1" r:id="rIdvj5sclnkc4boeg6ntkspo">
         <w:r>
           <w:rPr>
             <w:rStyle w:val="Hyperlink"/>
@@ -7067,7 +7085,7 @@
         </w:rPr>
         <w:t xml:space="preserve"> </w:t>
       </w:r>
-      <w:hyperlink w:history="1" r:id="rIdchm1dzawx1z7j3troovhp">
+      <w:hyperlink w:history="1" r:id="rIdhe3lsr3mzcqkdcvbkxy0o">
         <w:r>
           <w:rPr>
             <w:rStyle w:val="Hyperlink"/>
@@ -7121,7 +7139,7 @@
         </w:rPr>
         <w:t xml:space="preserve"> </w:t>
       </w:r>
-      <w:hyperlink w:history="1" r:id="rIdjl2y7rk8_ps7hg67gbigl">
+      <w:hyperlink w:history="1" r:id="rIdmf09szr7q0xs_ufkgncug">
         <w:r>
           <w:rPr>
             <w:rStyle w:val="Hyperlink"/>
@@ -7175,7 +7193,7 @@
         </w:rPr>
         <w:t xml:space="preserve"> </w:t>
       </w:r>
-      <w:hyperlink w:history="1" r:id="rIdgpjuolxbvkhym1zoksusv">
+      <w:hyperlink w:history="1" r:id="rIdem3my-ujfm05hfdoduhkq">
         <w:r>
           <w:rPr>
             <w:rStyle w:val="Hyperlink"/>
@@ -7229,7 +7247,7 @@
         </w:rPr>
         <w:t xml:space="preserve"> </w:t>
       </w:r>
-      <w:hyperlink w:history="1" r:id="rIdx7soyooacg0c76u3hw4tk">
+      <w:hyperlink w:history="1" r:id="rIdzy59spruwn1uc7utmbytj">
         <w:r>
           <w:rPr>
             <w:rStyle w:val="Hyperlink"/>
@@ -7283,7 +7301,7 @@
         </w:rPr>
         <w:t xml:space="preserve"> </w:t>
       </w:r>
-      <w:hyperlink w:history="1" r:id="rIdto6frfax-bqvh0gr6ih_x">
+      <w:hyperlink w:history="1" r:id="rIdq0rqdkuppahnszjm7txj9">
         <w:r>
           <w:rPr>
             <w:rStyle w:val="Hyperlink"/>
@@ -7337,7 +7355,7 @@
         </w:rPr>
         <w:t xml:space="preserve"> </w:t>
       </w:r>
-      <w:hyperlink w:history="1" r:id="rIdqwihxjkhelyam_jq4gtci">
+      <w:hyperlink w:history="1" r:id="rIdxdjqkziq4i1dxjur6tpuy">
         <w:r>
           <w:rPr>
             <w:rStyle w:val="Hyperlink"/>

</xml_diff>

<commit_message>
Vérifie les chiffres du rapport de la Cour des comptes sur le commerce de proximité
Rapport relu (124 pages) : les chiffres repris de synthèses passent au
niveau « relu dans la source », avec champ et page précisés. Ajoute les
constats sur la faible corrélation entre centre et périphérie, l'accès
au commerce, les foncières de redynamisation et le FRLA.

Co-Authored-By: Claude Opus 5.5 <noreply@anthropic.com>
Claude-Session: https://claude.ai/code/session_01C7XiPcXpETUWAHMH28sD58
</commit_message>
<xml_diff>
--- a/etat_de_l_art/etat_de_l_art_zones_commerciales_centres_villes_QPV.docx
+++ b/etat_de_l_art/etat_de_l_art_zones_commerciales_centres_villes_QPV.docx
@@ -2944,7 +2944,7 @@
           <w:sz w:val="18"/>
           <w:szCs w:val="18"/>
         </w:rPr>
-        <w:t xml:space="preserve">  —  Champ : commerce de proximité, 2017-2022</w:t>
+        <w:t xml:space="preserve">  —  Champ : commerce de proximité au sens de la Cour, 2017-2022</w:t>
       </w:r>
     </w:p>
     <w:p>
@@ -2952,7 +2952,7 @@
         <w:spacing w:after="120" w:line="276"/>
       </w:pPr>
       <w:r>
-        <w:t xml:space="preserve">La Cour décrit un secteur d'environ 700 000 entreprises et 1,1 million d'emplois, salariés et non salariés ; 68 % des entreprises n'ont aucun salarié. La part de marché du commerce alimentaire spécialisé passe de 22 % en 1993 à 17 % en 2017, puis remonte à 20 % en 2021, avec l'essor des supérettes. Les ventes en ligne représentent 12,5 % des ventes du commerce de détail en 2022. Selon les synthèses du rapport, la vacance commerciale en centre-ville passe de 7 % en 2012 à 12,3 % en 2020, et près de 40 villes dépassent 20 %.</w:t>
+        <w:t xml:space="preserve">La Cour retient un champ restreint : commerces alimentaires spécialisés, artisanat commercial et services (coiffure, soins), soit environ 700 000 entreprises et 1,1 million d'emplois ; 68 % des entreprises n'ont aucun salarié. Dans l'alimentaire, la part de marché du commerce de proximité passe de 22 % en 1993 à 17 % en 2017, puis remonte à 20 % en 2021. Les ventes en ligne représentent 12,5 % des ventes du commerce de détail en 2022.</w:t>
       </w:r>
     </w:p>
     <w:p>
@@ -2960,7 +2960,23 @@
         <w:spacing w:after="120" w:line="276"/>
       </w:pPr>
       <w:r>
-        <w:t xml:space="preserve">Environ 500 millions d'euros d'aides ont été attribués au secteur entre 2018 et 2022. L'État a cessé les aides économiques directes aux petits commerces au profit de programmes territoriaux (Action Cœur de Ville, Petites villes de demain) ; les crédits du FISAC sont passés de 80 millions d'euros en 2007 à 16 millions en 2018 avant sa suppression. La Cour pointe une profusion de dispositifs aux résultats inégaux, une coordination insuffisante entre l'État et les collectivités et un manque d'indicateurs de suivi. Le rapport n'a pas pu être ouvert directement : ces chiffres proviennent de synthèses et sont à vérifier.</w:t>
+        <w:t xml:space="preserve">Le taux de vacance commerciale progresse fortement entre 2012 et 2020, en particulier dans les centres-villes, où il passe de 7 % à 12,3 % en moyenne. En 2022, près de 40 villes dépassent 20 % et 12 dépassent 25 %. La Cour souligne que « les dynamiques commerciales du centre-ville et de la périphérie ne sont pas toujours corrélées » : on observe des pôles périphériques florissants avec des centres en déprise, mais aussi des pôles dynamiques dans les deux zones, ou en recul dans les deux. Selon elle, « le taux de vacance semble plutôt lié à l'évolution démographique du bassin de vie ».</w:t>
+      </w:r>
+    </w:p>
+    <w:p>
+      <w:pPr>
+        <w:spacing w:after="120" w:line="276"/>
+      </w:pPr>
+      <w:r>
+        <w:t xml:space="preserve">Sur l'accès au commerce, 62 % des communes n'ont plus aucun commerce de détail en 2021, contre 53 % en 2010. Dans les communes situées en périphérie des moyens et petits pôles, 70 à 80 % des habitants, soit 31 % de la population, ont un faible accès au commerce spécialisé (habillement, loisirs, culture, sport).</w:t>
+      </w:r>
+    </w:p>
+    <w:p>
+      <w:pPr>
+        <w:spacing w:after="120" w:line="276"/>
+      </w:pPr>
+      <w:r>
+        <w:t xml:space="preserve">Côté politiques publiques, la Cour estime à environ 500 millions d'euros les ressources consacrées au commerce de proximité entre 2018 et 2022, dont environ 180 millions de participations de la Banque des Territoires dans les foncières de redynamisation. Fin 2022, 63 foncières sont en activité (dont six en QPV), pour un objectif de 100, et elles ont permis 118 créations nettes de commerces. Les crédits du FISAC sont passés de 80 millions d'euros en 2007 à 16 millions en 2018 avant sa suppression. La vacance moyenne des villes Action Cœur de Ville baisse un peu plus vite que dans les autres villes moyennes depuis 2021, mais environ 40 % des communes du programme ont vu la leur se dégrader. La Cour pointe un manque d'indicateurs et d'évaluation, et formule neuf recommandations, dont la construction en 2024 d'un dispositif de suivi du commerce de proximité.</w:t>
       </w:r>
     </w:p>
     <w:p>
@@ -4567,7 +4583,7 @@
         </w:rPr>
         <w:t xml:space="preserve"> </w:t>
       </w:r>
-      <w:hyperlink w:history="1" r:id="rIdum1usc8jzi7whfvjp6azz">
+      <w:hyperlink w:history="1" r:id="rIdm5yy1vrphgvo8yogqn4yu">
         <w:r>
           <w:rPr>
             <w:rStyle w:val="Hyperlink"/>
@@ -4621,7 +4637,7 @@
         </w:rPr>
         <w:t xml:space="preserve"> </w:t>
       </w:r>
-      <w:hyperlink w:history="1" r:id="rId2mjx7itpcy69ad8yhleef">
+      <w:hyperlink w:history="1" r:id="rId9qqtrpa7cy6uknwr68oal">
         <w:r>
           <w:rPr>
             <w:rStyle w:val="Hyperlink"/>
@@ -4675,7 +4691,7 @@
         </w:rPr>
         <w:t xml:space="preserve"> </w:t>
       </w:r>
-      <w:hyperlink w:history="1" r:id="rId1jcjy6ssupmh_fk3k9zrz">
+      <w:hyperlink w:history="1" r:id="rId-n_gblwzp5q_5nncdds-k">
         <w:r>
           <w:rPr>
             <w:rStyle w:val="Hyperlink"/>
@@ -4729,7 +4745,7 @@
         </w:rPr>
         <w:t xml:space="preserve"> </w:t>
       </w:r>
-      <w:hyperlink w:history="1" r:id="rIdg96olbtinjorzdq_nvdau">
+      <w:hyperlink w:history="1" r:id="rIds3ad6tbro1xqewtz23fih">
         <w:r>
           <w:rPr>
             <w:rStyle w:val="Hyperlink"/>
@@ -4783,7 +4799,7 @@
         </w:rPr>
         <w:t xml:space="preserve"> </w:t>
       </w:r>
-      <w:hyperlink w:history="1" r:id="rIdcou1m8aktgwtvluxnraww">
+      <w:hyperlink w:history="1" r:id="rIdl91jtm8fxvbbycazstmfn">
         <w:r>
           <w:rPr>
             <w:rStyle w:val="Hyperlink"/>
@@ -4882,7 +4898,7 @@
         </w:rPr>
         <w:t xml:space="preserve"> </w:t>
       </w:r>
-      <w:hyperlink w:history="1" r:id="rIdproiybrppl_m2upvuud6u">
+      <w:hyperlink w:history="1" r:id="rIdrzk-t4q3g8reyxe7ibsch">
         <w:r>
           <w:rPr>
             <w:rStyle w:val="Hyperlink"/>
@@ -4936,7 +4952,7 @@
         </w:rPr>
         <w:t xml:space="preserve"> </w:t>
       </w:r>
-      <w:hyperlink w:history="1" r:id="rIdoes1hnclkdo_-ckwygfiz">
+      <w:hyperlink w:history="1" r:id="rIdqfqv9onstzlcto_wvq3lo">
         <w:r>
           <w:rPr>
             <w:rStyle w:val="Hyperlink"/>
@@ -4990,7 +5006,7 @@
         </w:rPr>
         <w:t xml:space="preserve"> </w:t>
       </w:r>
-      <w:hyperlink w:history="1" r:id="rIdyy7ohgabdjakvxr2ihgal">
+      <w:hyperlink w:history="1" r:id="rIdvlm6jiesbkapalvzhrn2t">
         <w:r>
           <w:rPr>
             <w:rStyle w:val="Hyperlink"/>
@@ -5044,7 +5060,7 @@
         </w:rPr>
         <w:t xml:space="preserve"> </w:t>
       </w:r>
-      <w:hyperlink w:history="1" r:id="rId0kyr5t3p247ejt8mxyqjk">
+      <w:hyperlink w:history="1" r:id="rIdrcbs5ftecyzw1-sqrewyv">
         <w:r>
           <w:rPr>
             <w:rStyle w:val="Hyperlink"/>
@@ -5098,7 +5114,7 @@
         </w:rPr>
         <w:t xml:space="preserve"> </w:t>
       </w:r>
-      <w:hyperlink w:history="1" r:id="rIdxcgy42_tizyhkgypab61e">
+      <w:hyperlink w:history="1" r:id="rIdnfipoj3yagqdmuxnpswxs">
         <w:r>
           <w:rPr>
             <w:rStyle w:val="Hyperlink"/>
@@ -5152,7 +5168,7 @@
         </w:rPr>
         <w:t xml:space="preserve"> </w:t>
       </w:r>
-      <w:hyperlink w:history="1" r:id="rIdyjfbq1mrmoororcsztfx4">
+      <w:hyperlink w:history="1" r:id="rIdpwx-qdscgbfatimcdjtok">
         <w:r>
           <w:rPr>
             <w:rStyle w:val="Hyperlink"/>
@@ -5206,7 +5222,7 @@
         </w:rPr>
         <w:t xml:space="preserve"> </w:t>
       </w:r>
-      <w:hyperlink w:history="1" r:id="rId-y6wc_l5tvllffzwftcaw">
+      <w:hyperlink w:history="1" r:id="rIddcs1-bjm2ugute7bdeuwx">
         <w:r>
           <w:rPr>
             <w:rStyle w:val="Hyperlink"/>
@@ -5260,7 +5276,7 @@
         </w:rPr>
         <w:t xml:space="preserve"> </w:t>
       </w:r>
-      <w:hyperlink w:history="1" r:id="rIdulnyxkl3ivubmsiyqioaa">
+      <w:hyperlink w:history="1" r:id="rIdwarunq_evxo8mf4jwvxmb">
         <w:r>
           <w:rPr>
             <w:rStyle w:val="Hyperlink"/>
@@ -5314,7 +5330,7 @@
         </w:rPr>
         <w:t xml:space="preserve"> </w:t>
       </w:r>
-      <w:hyperlink w:history="1" r:id="rIdfcswqs1srtwxzg33qetkh">
+      <w:hyperlink w:history="1" r:id="rIdn2a8awsclxd8is6nn8ii0">
         <w:r>
           <w:rPr>
             <w:rStyle w:val="Hyperlink"/>
@@ -5368,7 +5384,7 @@
         </w:rPr>
         <w:t xml:space="preserve"> </w:t>
       </w:r>
-      <w:hyperlink w:history="1" r:id="rIdv9bhf78otol_1h0obmjcd">
+      <w:hyperlink w:history="1" r:id="rIdz7ol5m0ldbizmlhggnf3-">
         <w:r>
           <w:rPr>
             <w:rStyle w:val="Hyperlink"/>
@@ -5422,7 +5438,7 @@
         </w:rPr>
         <w:t xml:space="preserve"> </w:t>
       </w:r>
-      <w:hyperlink w:history="1" r:id="rId3omj72afmjcmowuaekjne">
+      <w:hyperlink w:history="1" r:id="rIdazpzzh4ogwsottswo47w_">
         <w:r>
           <w:rPr>
             <w:rStyle w:val="Hyperlink"/>
@@ -5476,7 +5492,7 @@
         </w:rPr>
         <w:t xml:space="preserve"> </w:t>
       </w:r>
-      <w:hyperlink w:history="1" r:id="rId_kkjmyfpfrlt1erpxyxwn">
+      <w:hyperlink w:history="1" r:id="rIdcol4j5azhrocxugyvjrm0">
         <w:r>
           <w:rPr>
             <w:rStyle w:val="Hyperlink"/>
@@ -5538,7 +5554,7 @@
         </w:rPr>
         <w:t xml:space="preserve"> </w:t>
       </w:r>
-      <w:hyperlink w:history="1" r:id="rIdgsvlyvu2hqkmecr3j538v">
+      <w:hyperlink w:history="1" r:id="rIdgw72zku31c7utcjyji_up">
         <w:r>
           <w:rPr>
             <w:rStyle w:val="Hyperlink"/>
@@ -5592,7 +5608,7 @@
         </w:rPr>
         <w:t xml:space="preserve"> </w:t>
       </w:r>
-      <w:hyperlink w:history="1" r:id="rId-rlikggtbdliiwkvhlbjo">
+      <w:hyperlink w:history="1" r:id="rId_nakalagevtihyv8ficyw">
         <w:r>
           <w:rPr>
             <w:rStyle w:val="Hyperlink"/>
@@ -5646,7 +5662,7 @@
         </w:rPr>
         <w:t xml:space="preserve"> </w:t>
       </w:r>
-      <w:hyperlink w:history="1" r:id="rIdxkjgfihveps_ckmpkesu7">
+      <w:hyperlink w:history="1" r:id="rIdonizocnd23kc_refxdr-_">
         <w:r>
           <w:rPr>
             <w:rStyle w:val="Hyperlink"/>
@@ -5700,7 +5716,7 @@
         </w:rPr>
         <w:t xml:space="preserve"> </w:t>
       </w:r>
-      <w:hyperlink w:history="1" r:id="rIdftmla2pgm1kh31zg9tcba">
+      <w:hyperlink w:history="1" r:id="rId_bpgy8smp_fbk84n3qjuw">
         <w:r>
           <w:rPr>
             <w:rStyle w:val="Hyperlink"/>
@@ -5754,7 +5770,7 @@
         </w:rPr>
         <w:t xml:space="preserve"> </w:t>
       </w:r>
-      <w:hyperlink w:history="1" r:id="rIdx0o9rdvnm5ztllmxqfkiq">
+      <w:hyperlink w:history="1" r:id="rIdi1ydd5rjio1prqz1tpqad">
         <w:r>
           <w:rPr>
             <w:rStyle w:val="Hyperlink"/>
@@ -5808,7 +5824,7 @@
         </w:rPr>
         <w:t xml:space="preserve"> </w:t>
       </w:r>
-      <w:hyperlink w:history="1" r:id="rIdre4yvperu3cxgab3dnibo">
+      <w:hyperlink w:history="1" r:id="rId_2ulc9ql1n1otoifkyqsg">
         <w:r>
           <w:rPr>
             <w:rStyle w:val="Hyperlink"/>
@@ -5862,7 +5878,7 @@
         </w:rPr>
         <w:t xml:space="preserve"> </w:t>
       </w:r>
-      <w:hyperlink w:history="1" r:id="rIduducp7l5tpztdo5brgovx">
+      <w:hyperlink w:history="1" r:id="rIdzdtopv6t6q-sqxm-2zpyr">
         <w:r>
           <w:rPr>
             <w:rStyle w:val="Hyperlink"/>
@@ -5916,7 +5932,7 @@
         </w:rPr>
         <w:t xml:space="preserve"> </w:t>
       </w:r>
-      <w:hyperlink w:history="1" r:id="rIdmqrb7s58zf1ewtjfdaf26">
+      <w:hyperlink w:history="1" r:id="rId1cwj-f7gdu25jkg9zpz98">
         <w:r>
           <w:rPr>
             <w:rStyle w:val="Hyperlink"/>
@@ -5970,7 +5986,7 @@
         </w:rPr>
         <w:t xml:space="preserve"> </w:t>
       </w:r>
-      <w:hyperlink w:history="1" r:id="rIdyq0pn3zmcr1grdz4mtur1">
+      <w:hyperlink w:history="1" r:id="rIdmb92wmcxoouizmy88uvro">
         <w:r>
           <w:rPr>
             <w:rStyle w:val="Hyperlink"/>
@@ -6024,7 +6040,7 @@
         </w:rPr>
         <w:t xml:space="preserve"> </w:t>
       </w:r>
-      <w:hyperlink w:history="1" r:id="rIdld2ysjxp6e3u-dmwel4lp">
+      <w:hyperlink w:history="1" r:id="rIdf673pkbq8tlygnlgljakd">
         <w:r>
           <w:rPr>
             <w:rStyle w:val="Hyperlink"/>
@@ -6078,7 +6094,7 @@
         </w:rPr>
         <w:t xml:space="preserve"> </w:t>
       </w:r>
-      <w:hyperlink w:history="1" r:id="rIdmyrofaktsnzveujce9mqa">
+      <w:hyperlink w:history="1" r:id="rId6uszo_bi1v-yn25kh7ii4">
         <w:r>
           <w:rPr>
             <w:rStyle w:val="Hyperlink"/>
@@ -6132,7 +6148,7 @@
         </w:rPr>
         <w:t xml:space="preserve"> </w:t>
       </w:r>
-      <w:hyperlink w:history="1" r:id="rIdgprdc0n1_atrklbqjjkgc">
+      <w:hyperlink w:history="1" r:id="rIdkey5exnah3fxibl01uya9">
         <w:r>
           <w:rPr>
             <w:rStyle w:val="Hyperlink"/>
@@ -6186,7 +6202,7 @@
         </w:rPr>
         <w:t xml:space="preserve"> </w:t>
       </w:r>
-      <w:hyperlink w:history="1" r:id="rIdfweswv7zdoenexvcz9tkv">
+      <w:hyperlink w:history="1" r:id="rIdtoqbxub_trucfsbyqzynt">
         <w:r>
           <w:rPr>
             <w:rStyle w:val="Hyperlink"/>
@@ -6240,7 +6256,7 @@
         </w:rPr>
         <w:t xml:space="preserve"> </w:t>
       </w:r>
-      <w:hyperlink w:history="1" r:id="rIdodsq-yjbnlzrlao_awqyk">
+      <w:hyperlink w:history="1" r:id="rIdhyk71yjvxi2svih65htyu">
         <w:r>
           <w:rPr>
             <w:rStyle w:val="Hyperlink"/>
@@ -6294,7 +6310,7 @@
         </w:rPr>
         <w:t xml:space="preserve"> </w:t>
       </w:r>
-      <w:hyperlink w:history="1" r:id="rIdmb7pcqtx--7mkas8yy7pw">
+      <w:hyperlink w:history="1" r:id="rIdr9cyvnzjx0d84istsy_gk">
         <w:r>
           <w:rPr>
             <w:rStyle w:val="Hyperlink"/>
@@ -6348,7 +6364,7 @@
         </w:rPr>
         <w:t xml:space="preserve"> </w:t>
       </w:r>
-      <w:hyperlink w:history="1" r:id="rId2e4px8xw2nbcbdyc93ffc">
+      <w:hyperlink w:history="1" r:id="rIdysjzidk0pazpibpinhes-">
         <w:r>
           <w:rPr>
             <w:rStyle w:val="Hyperlink"/>
@@ -6410,7 +6426,7 @@
         </w:rPr>
         <w:t xml:space="preserve"> </w:t>
       </w:r>
-      <w:hyperlink w:history="1" r:id="rIdeosyj_bdg_nre5xwl8qgw">
+      <w:hyperlink w:history="1" r:id="rId077po_0new8mo5xl2xckh">
         <w:r>
           <w:rPr>
             <w:rStyle w:val="Hyperlink"/>
@@ -6472,7 +6488,7 @@
         </w:rPr>
         <w:t xml:space="preserve"> </w:t>
       </w:r>
-      <w:hyperlink w:history="1" r:id="rIdufidw5-4bkst_mhkmz7ns">
+      <w:hyperlink w:history="1" r:id="rIderfflht9gneuz9m8fmnp7">
         <w:r>
           <w:rPr>
             <w:rStyle w:val="Hyperlink"/>
@@ -6608,7 +6624,7 @@
         </w:rPr>
         <w:t xml:space="preserve"> </w:t>
       </w:r>
-      <w:hyperlink w:history="1" r:id="rIdcjq7phjt9qljzetykbbu7">
+      <w:hyperlink w:history="1" r:id="rIdlhdjafjscxrbboodcro8i">
         <w:r>
           <w:rPr>
             <w:rStyle w:val="Hyperlink"/>
@@ -6662,7 +6678,7 @@
         </w:rPr>
         <w:t xml:space="preserve"> </w:t>
       </w:r>
-      <w:hyperlink w:history="1" r:id="rIdpkcbroq4_prcj-hlll5cz">
+      <w:hyperlink w:history="1" r:id="rIdzgqui9jxxp-kbvopbq36j">
         <w:r>
           <w:rPr>
             <w:rStyle w:val="Hyperlink"/>
@@ -6753,7 +6769,7 @@
         </w:rPr>
         <w:t xml:space="preserve"> </w:t>
       </w:r>
-      <w:hyperlink w:history="1" r:id="rIddmutwwbei4g2nsjcqdzuk">
+      <w:hyperlink w:history="1" r:id="rIdaykr4p_ercfqzrkgcxnzc">
         <w:r>
           <w:rPr>
             <w:rStyle w:val="Hyperlink"/>
@@ -6807,7 +6823,7 @@
         </w:rPr>
         <w:t xml:space="preserve"> </w:t>
       </w:r>
-      <w:hyperlink w:history="1" r:id="rId54utamv9bisgvfiiouhx5">
+      <w:hyperlink w:history="1" r:id="rIdraevjmff3fyiin_5xst4q">
         <w:r>
           <w:rPr>
             <w:rStyle w:val="Hyperlink"/>
@@ -6869,7 +6885,7 @@
         </w:rPr>
         <w:t xml:space="preserve"> </w:t>
       </w:r>
-      <w:hyperlink w:history="1" r:id="rId3ruls6nmqawbhuyeoibbu">
+      <w:hyperlink w:history="1" r:id="rIdp0ptrxw8x7vzxgsx-ogbm">
         <w:r>
           <w:rPr>
             <w:rStyle w:val="Hyperlink"/>
@@ -6923,7 +6939,7 @@
         </w:rPr>
         <w:t xml:space="preserve"> </w:t>
       </w:r>
-      <w:hyperlink w:history="1" r:id="rId5osqfxqrzpk1jdvyi_quc">
+      <w:hyperlink w:history="1" r:id="rId0liyv0hlvfyikjcudvmi3">
         <w:r>
           <w:rPr>
             <w:rStyle w:val="Hyperlink"/>
@@ -6977,7 +6993,7 @@
         </w:rPr>
         <w:t xml:space="preserve"> </w:t>
       </w:r>
-      <w:hyperlink w:history="1" r:id="rIdsvwivj26wvho5nvpbwya8">
+      <w:hyperlink w:history="1" r:id="rIdiyl4nkhallpxjo_yxu94q">
         <w:r>
           <w:rPr>
             <w:rStyle w:val="Hyperlink"/>
@@ -7031,7 +7047,7 @@
         </w:rPr>
         <w:t xml:space="preserve"> </w:t>
       </w:r>
-      <w:hyperlink w:history="1" r:id="rIdvj5sclnkc4boeg6ntkspo">
+      <w:hyperlink w:history="1" r:id="rIdyh5gutlqixdxnvez2graa">
         <w:r>
           <w:rPr>
             <w:rStyle w:val="Hyperlink"/>
@@ -7085,7 +7101,7 @@
         </w:rPr>
         <w:t xml:space="preserve"> </w:t>
       </w:r>
-      <w:hyperlink w:history="1" r:id="rIdhe3lsr3mzcqkdcvbkxy0o">
+      <w:hyperlink w:history="1" r:id="rIdsncau1xmsigxysfpn3ynx">
         <w:r>
           <w:rPr>
             <w:rStyle w:val="Hyperlink"/>
@@ -7139,7 +7155,7 @@
         </w:rPr>
         <w:t xml:space="preserve"> </w:t>
       </w:r>
-      <w:hyperlink w:history="1" r:id="rIdmf09szr7q0xs_ufkgncug">
+      <w:hyperlink w:history="1" r:id="rIdljfev1zpm8vwawg7fp6dv">
         <w:r>
           <w:rPr>
             <w:rStyle w:val="Hyperlink"/>
@@ -7193,7 +7209,7 @@
         </w:rPr>
         <w:t xml:space="preserve"> </w:t>
       </w:r>
-      <w:hyperlink w:history="1" r:id="rIdem3my-ujfm05hfdoduhkq">
+      <w:hyperlink w:history="1" r:id="rIdj7xg4r0blnwgok5lrskzu">
         <w:r>
           <w:rPr>
             <w:rStyle w:val="Hyperlink"/>
@@ -7247,7 +7263,7 @@
         </w:rPr>
         <w:t xml:space="preserve"> </w:t>
       </w:r>
-      <w:hyperlink w:history="1" r:id="rIdzy59spruwn1uc7utmbytj">
+      <w:hyperlink w:history="1" r:id="rIdykg8whrtn9okdz84tk6ju">
         <w:r>
           <w:rPr>
             <w:rStyle w:val="Hyperlink"/>
@@ -7301,7 +7317,7 @@
         </w:rPr>
         <w:t xml:space="preserve"> </w:t>
       </w:r>
-      <w:hyperlink w:history="1" r:id="rIdq0rqdkuppahnszjm7txj9">
+      <w:hyperlink w:history="1" r:id="rIdlnlq4_rte-7dmd1xf7n3p">
         <w:r>
           <w:rPr>
             <w:rStyle w:val="Hyperlink"/>
@@ -7355,7 +7371,7 @@
         </w:rPr>
         <w:t xml:space="preserve"> </w:t>
       </w:r>
-      <w:hyperlink w:history="1" r:id="rIdxdjqkziq4i1dxjur6tpuy">
+      <w:hyperlink w:history="1" r:id="rIdannjnoneunvf_rom1oa5q">
         <w:r>
           <w:rPr>
             <w:rStyle w:val="Hyperlink"/>

</xml_diff>

<commit_message>
Ajoute le registre en ligne et la seconde vérification des sources
Registre interactif (recherche, filtres, graphiques des sources,
ajout et correction de chiffres avec journal) alimenté par base.json,
désormais source unique du classeur et du document. La seconde
vérification corrige ou rétrograde une vingtaine de chiffres (années,
valeurs, intitulés, sources dont la page a changé).

Co-Authored-By: Claude Opus 5.5 <noreply@anthropic.com>
Claude-Session: https://claude.ai/code/session_01C7XiPcXpETUWAHMH28sD58
</commit_message>
<xml_diff>
--- a/etat_de_l_art/etat_de_l_art_zones_commerciales_centres_villes_QPV.docx
+++ b/etat_de_l_art/etat_de_l_art_zones_commerciales_centres_villes_QPV.docx
@@ -315,6 +315,26 @@
       </w:r>
       <w:r>
         <w:t xml:space="preserve"> Les chiffres relus dans le document d'origine sont distingués, dans le classeur, de ceux lus via un relais (presse, synthèse). Les chiffres dont l'origine n'a pas pu être établie sont signalés.</w:t>
+      </w:r>
+    </w:p>
+    <w:p>
+      <w:pPr>
+        <w:pStyle w:val="ListParagraph"/>
+        <w:numPr>
+          <w:ilvl w:val="0"/>
+          <w:numId w:val="2"/>
+        </w:numPr>
+        <w:spacing w:after="60" w:line="264"/>
+      </w:pPr>
+      <w:r>
+        <w:rPr>
+          <w:b/>
+          <w:bCs/>
+        </w:rPr>
+        <w:t xml:space="preserve">Une seconde vérification a été menée le 1er octobre 2026.</w:t>
+      </w:r>
+      <w:r>
+        <w:t xml:space="preserve"> Chaque source a été retéléchargée et chaque chiffre recherché dans son texte. Une vingtaine de chiffres ont été corrigés (année, valeur, intitulé) ou signalés comme introuvables ; le détail figure dans le classeur et dans le registre en ligne.</w:t>
       </w:r>
     </w:p>
     <w:p>
@@ -2280,7 +2300,7 @@
         <w:spacing w:after="120" w:line="276"/>
       </w:pPr>
       <w:r>
-        <w:t xml:space="preserve">Le Sénat parle d'« obésité commerciale » : les surfaces commerciales ont doublé entre 2000 et 2020 sans hausse équivalente des dépenses des ménages.</w:t>
+        <w:t xml:space="preserve">Le Sénat reprend l'expression d'« obésité commerciale », en citant Pascal Madry : « il y a trop de m² en France ». Le doublement des surfaces entre 2000 et 2020, souvent attribué à ce rapport, n'a pas été retrouvé dans le chapitre consulté.</w:t>
       </w:r>
     </w:p>
     <w:p>
@@ -2558,7 +2578,7 @@
         <w:spacing w:after="120" w:line="276"/>
       </w:pPr>
       <w:r>
-        <w:t xml:space="preserve">La vacance commerciale passe de 6 % en 2001 à plus de 10 % en 2015.</w:t>
+        <w:t xml:space="preserve">La vacance commerciale passerait de 6 % en 2001 à plus de 10 % en 2015. Ce chiffre n'a pas été retrouvé dans l'article lors de la seconde vérification : il reste à confirmer.</w:t>
       </w:r>
     </w:p>
     <w:p>
@@ -2602,7 +2622,7 @@
         <w:spacing w:after="120" w:line="276"/>
       </w:pPr>
       <w:r>
-        <w:t xml:space="preserve">La vacance augmente dans 87 % des 900 centres-villes étudiés.</w:t>
+        <w:t xml:space="preserve">La vacance augmenterait dans 87 % des 900 centres-villes étudiés. Cette mention n'a pas été retrouvée sur la page du Cerema citée : l'origine reste à établir.</w:t>
       </w:r>
     </w:p>
     <w:p>
@@ -2778,7 +2798,7 @@
         <w:spacing w:after="120" w:line="276"/>
       </w:pPr>
       <w:r>
-        <w:t xml:space="preserve">En 2022, la vacance atteint 12,5 % dans les villes ACV contre 7,39 % dans un groupe de comparaison ; elle a baissé de 1,7 point depuis le pic de 2020 dans les villes ACV, contre 0,3 point hors programme. En 2024, le baromètre Codata / FACT relève 13,4 % dans les villes ACV et 7,7 % hors ACV. Certaines villes ont fortement réduit leur vacance entre 2018 et 2022 : Vierzon (de 28,8 % à 22,2 %), Calais (d'environ 21,5 % à 14 %), Bagnols-sur-Cèze (de 21,3 % à 14,3 %).</w:t>
+        <w:t xml:space="preserve">Après un pic à 14,5 % en 2020 (7,6 % hors programme), la vacance atteint 12,5 % dans les villes ACV en 2022, contre 7,39 % dans un groupe de comparaison : une baisse de 1,7 point dans les villes ACV, contre 0,3 point hors programme. L'étude n'observe « pas ou peu de relation » entre vacance, dynamique démographique et revenu. Le baromètre Codata / FACT 2024 relève ensuite, pour 2023, 13,4 % dans les villes ACV et 7,7 % hors ACV. Certaines villes ont fortement réduit leur vacance entre 2018 et 2022 : Vierzon (de 28,8 % à 22,2 %), Calais (de 21,7 % à 14 %), Bagnols-sur-Cèze (de 21,3 % à 14,3 %).</w:t>
       </w:r>
     </w:p>
     <w:p>
@@ -2796,7 +2816,7 @@
           <w:bCs/>
           <w:color w:val="003087"/>
         </w:rPr>
-        <w:t xml:space="preserve">Banque des Territoires (données 2020-2022)</w:t>
+        <w:t xml:space="preserve">FACT, étude publiée le 1er décembre 2025 (via la Banque des Territoires)</w:t>
       </w:r>
       <w:r>
         <w:rPr>
@@ -2814,7 +2834,7 @@
           <w:sz w:val="18"/>
           <w:szCs w:val="18"/>
         </w:rPr>
-        <w:t xml:space="preserve">  —  Champ : centres-villes selon la taille du bassin</w:t>
+        <w:t xml:space="preserve">  —  Champ : centres-villes de 355 communes suivies par Codata</w:t>
       </w:r>
     </w:p>
     <w:p>
@@ -2822,7 +2842,7 @@
         <w:spacing w:after="120" w:line="276"/>
       </w:pPr>
       <w:r>
-        <w:t xml:space="preserve">La vacance reste sous 9 % dans les cœurs de métropole (de 7,6 % à 8,3 %), stagne autour de 11 % dans les grandes villes, et baisse entre 2020 et 2022 dans les villes moyennes (de 13,6 % à 12,6 %) et les petites villes (de 13,1 % à 12 %).</w:t>
+        <w:t xml:space="preserve">Hors Île-de-France, la vacance en centre-ville progresse d'un point entre 2019 et 2024, contre 3,2 points entre 2014 et 2019. 37 % des villes l'ont réduite sur la période (12 % entre 2014 et 2019). Dans les villes de 50 000 à 100 000 habitants, elle se stabilise à 10,8 % (10,6 % en 2019). Dans les villes de plus de 100 000 habitants, elle reste plus faible (8,7 %, contre 11 % pour l'ensemble) mais augmente plus vite. Selon l'étude, ni la démographie, ni l'offre touristique, ni la présence d'enseignes nationales n'expliquent ces évolutions.</w:t>
       </w:r>
     </w:p>
     <w:p>
@@ -2856,7 +2876,7 @@
         <w:spacing w:after="120" w:line="276"/>
       </w:pPr>
       <w:r>
-        <w:t xml:space="preserve">La mission relève qu'environ une boutique sur dix est fermée en centre-ville et que la vacance a doublé en dix ans. Les synthèses du rapport citent un taux national de 14 % en 2024 ; le champ exact de ce chiffre reste à vérifier dans le rapport intégral.</w:t>
+        <w:t xml:space="preserve">Le rapport de la mission indique une vacance de 10,64 % dans les centres-villes en 2024 (9,73 % en 2023) et de plus de 16 % dans les galeries marchandes. Le communiqué de la DGE annonce une vacance qui « a doublé en dix ans, atteignant 14 % en 2024 », sans préciser le champ.</w:t>
       </w:r>
     </w:p>
     <w:p>
@@ -3010,7 +3030,7 @@
         <w:spacing w:after="120" w:line="276"/>
       </w:pPr>
       <w:r>
-        <w:t xml:space="preserve">Le Sénat note que l'équipement de la personne représente 40 à 60 % de l'offre de certains centres-villes, ce qui les expose. Selon Codata, la part de l'habillement dans l'offre en pied d'immeuble passe de 20,92 % en 2015 à 15,05 % en 2024, tandis que la restauration progresse.</w:t>
+        <w:t xml:space="preserve">Le Sénat note que les secteurs déjà fragiles avant la crise sanitaire (prêt-à-porter, jouet, culture-loisirs) et ceux touchés par les mesures de distanciation (restaurants, bars) représentent 40 à 60 % de l'offre de nombreux centres-villes. Selon Codata, la part de l'habillement dans l'offre en pied d'immeuble passe de 20,92 % en 2015 à 15,05 % en 2024, tandis que la restauration progresse.</w:t>
       </w:r>
     </w:p>
     <w:p>
@@ -3248,7 +3268,7 @@
         <w:spacing w:after="120" w:line="276"/>
       </w:pPr>
       <w:r>
-        <w:t xml:space="preserve">La France compte 1 362 QPV en métropole au 1er janvier 2025 (156 dans les DROM, 91 en Polynésie et à Saint-Martin), soit plus de 6 millions d'habitants. Le taux de chômage y est de 18,3 % en 2022, contre 7,5 % dans les unités urbaines englobantes (25 % en 2014). En 2021, 45 % des habitants vivent sous le seuil de pauvreté, et le niveau de vie médian est de 1 213 € par mois contre 1 900 € dans le reste des agglomérations.</w:t>
+        <w:t xml:space="preserve">La France compte 1 362 QPV en métropole (géographie en vigueur au 1er janvier 2024) et 247 en outre-mer (1er janvier 2025). Le taux de chômage y est de 18,3 % en 2022, contre 7,5 % dans les unités urbaines englobantes (25 % en 2014). En 2021, 45 % des habitants vivent sous le seuil de pauvreté, et le niveau de vie médian est de 1 213 € par mois contre 1 900 € dans le reste des agglomérations.</w:t>
       </w:r>
     </w:p>
     <w:p>
@@ -3873,7 +3893,7 @@
         <w:spacing w:after="120" w:line="276"/>
       </w:pPr>
       <w:r>
-        <w:t xml:space="preserve">Lancé en mars 2018 pour 222 villes ou binômes (244 communes lauréates en 2025), le programme a mobilisé plus de 6 milliards d'euros sur 2018-2022 ; une enveloppe de 5 milliards d'euros accompagne la phase 2023-2026, avec un accent sur les entrées de ville. L'ANCT fait état de près de 29 000 commerces et locaux restructurés. La Cour des comptes relève une hausse de 14 % des transactions immobilières et une fréquentation en hausse de 15 % en 2021 (contre 2 % hors programme), mais juge le programme « ambitieux mais difficile à évaluer ». Le Sénat et la Cour pointent une évaluation insuffisante.</w:t>
+        <w:t xml:space="preserve">Lancé en mars 2018 pour 222 villes ou binômes (244 communes lauréates en 2025), le programme a mobilisé 5 milliards d'euros de crédits de l'État, de l'ANAH, d'Action Logement et de la Banque des Territoires sur 2018-2022 ; 5 milliards d'euros sont de nouveau alloués pour la phase suivante, avec un accent sur les entrées de ville. Selon des relais de presse, la Cour des comptes relève une hausse de 14 % des transactions immobilières et de 15 % de la fréquentation en 2021 (contre 2 % hors programme) ; ces chiffres n'ont pas pu être vérifiés dans le rapport. Elle juge le programme « ambitieux mais difficile à évaluer ». Le Sénat et la Cour pointent une évaluation insuffisante.</w:t>
       </w:r>
     </w:p>
     <w:p>
@@ -3907,7 +3927,7 @@
         <w:spacing w:after="120" w:line="276"/>
       </w:pPr>
       <w:r>
-        <w:t xml:space="preserve">Le programme, lancé en octobre 2020 pour les communes de moins de 20 000 habitants, soutient 1 646 communes au 31 décembre 2024 et a engagé 3,7 milliards d'euros, au-delà des 3 milliards prévus.</w:t>
+        <w:t xml:space="preserve">Le programme, lancé en octobre 2020 pour les communes de moins de 20 000 habitants, a investi 1,1 milliard d'euros en trois ans selon l'ANCT (juin 2023). Les chiffres de 1 646 communes et 3,7 milliards d'euros engagés fin 2024, souvent cités, n'ont pas été retrouvés sur la page consultée.</w:t>
       </w:r>
     </w:p>
     <w:p>
@@ -3941,7 +3961,7 @@
         <w:spacing w:after="120" w:line="276"/>
       </w:pPr>
       <w:r>
-        <w:t xml:space="preserve">Le plan d'un milliard d'euros consacre 800 millions aux foncières de redynamisation, avec l'objectif d'une centaine de foncières et de 6 000 commerces vacants ou dégradés remis sur le marché.</w:t>
+        <w:t xml:space="preserve">Le plan d'un milliard d'euros, annoncé en octobre 2020, consacre 800 millions aux foncières de redynamisation, avec l'objectif d'une centaine de foncières et de 6 000 commerces vacants ou dégradés remis sur le marché.</w:t>
       </w:r>
     </w:p>
     <w:p>
@@ -3975,7 +3995,7 @@
         <w:spacing w:after="120" w:line="276"/>
       </w:pPr>
       <w:r>
-        <w:t xml:space="preserve">Lancé en septembre 2023, le plan a retenu 74 lauréats en mars 2024 (26 millions d'euros) puis 16 en mai 2024 (5,4 millions d'euros), soit 90 projets et 31,4 millions d'euros. Le potentiel annoncé est de 25 000 logements pour les 74 premiers projets.</w:t>
+        <w:t xml:space="preserve">Lancé en septembre 2023, le plan a retenu 74 lauréats le 29 mars 2024 (26 millions d'euros, avec un second appel annoncé de 8 millions) puis 16 en mai 2024 (5,4 millions d'euros), soit 90 projets et 31,4 millions d'euros. Le potentiel annoncé est de 25 000 logements pour les 74 premiers projets.</w:t>
       </w:r>
     </w:p>
     <w:p>
@@ -4583,7 +4603,7 @@
         </w:rPr>
         <w:t xml:space="preserve"> </w:t>
       </w:r>
-      <w:hyperlink w:history="1" r:id="rIdm5yy1vrphgvo8yogqn4yu">
+      <w:hyperlink w:history="1" r:id="rId3xojs1mg7p6nbqyzpkq3i">
         <w:r>
           <w:rPr>
             <w:rStyle w:val="Hyperlink"/>
@@ -4637,7 +4657,7 @@
         </w:rPr>
         <w:t xml:space="preserve"> </w:t>
       </w:r>
-      <w:hyperlink w:history="1" r:id="rId9qqtrpa7cy6uknwr68oal">
+      <w:hyperlink w:history="1" r:id="rIdlbhjyxxtuhq21_ti5xeq_">
         <w:r>
           <w:rPr>
             <w:rStyle w:val="Hyperlink"/>
@@ -4691,7 +4711,7 @@
         </w:rPr>
         <w:t xml:space="preserve"> </w:t>
       </w:r>
-      <w:hyperlink w:history="1" r:id="rId-n_gblwzp5q_5nncdds-k">
+      <w:hyperlink w:history="1" r:id="rIdg9nvxmxd0hpbtyjqvywru">
         <w:r>
           <w:rPr>
             <w:rStyle w:val="Hyperlink"/>
@@ -4745,7 +4765,7 @@
         </w:rPr>
         <w:t xml:space="preserve"> </w:t>
       </w:r>
-      <w:hyperlink w:history="1" r:id="rIds3ad6tbro1xqewtz23fih">
+      <w:hyperlink w:history="1" r:id="rIdit-6wusbuzblobft9-9zc">
         <w:r>
           <w:rPr>
             <w:rStyle w:val="Hyperlink"/>
@@ -4799,7 +4819,7 @@
         </w:rPr>
         <w:t xml:space="preserve"> </w:t>
       </w:r>
-      <w:hyperlink w:history="1" r:id="rIdl91jtm8fxvbbycazstmfn">
+      <w:hyperlink w:history="1" r:id="rIdlenat3-7ek-mrizeous78">
         <w:r>
           <w:rPr>
             <w:rStyle w:val="Hyperlink"/>
@@ -4898,7 +4918,7 @@
         </w:rPr>
         <w:t xml:space="preserve"> </w:t>
       </w:r>
-      <w:hyperlink w:history="1" r:id="rIdrzk-t4q3g8reyxe7ibsch">
+      <w:hyperlink w:history="1" r:id="rIdrzgugfwy9domjmevmnhxy">
         <w:r>
           <w:rPr>
             <w:rStyle w:val="Hyperlink"/>
@@ -4952,7 +4972,7 @@
         </w:rPr>
         <w:t xml:space="preserve"> </w:t>
       </w:r>
-      <w:hyperlink w:history="1" r:id="rIdqfqv9onstzlcto_wvq3lo">
+      <w:hyperlink w:history="1" r:id="rIdixbuwc_9uxp44-ujpgk-j">
         <w:r>
           <w:rPr>
             <w:rStyle w:val="Hyperlink"/>
@@ -5006,7 +5026,7 @@
         </w:rPr>
         <w:t xml:space="preserve"> </w:t>
       </w:r>
-      <w:hyperlink w:history="1" r:id="rIdvlm6jiesbkapalvzhrn2t">
+      <w:hyperlink w:history="1" r:id="rIdbbti7vnpcn1x2a7rnvhn3">
         <w:r>
           <w:rPr>
             <w:rStyle w:val="Hyperlink"/>
@@ -5060,7 +5080,7 @@
         </w:rPr>
         <w:t xml:space="preserve"> </w:t>
       </w:r>
-      <w:hyperlink w:history="1" r:id="rIdrcbs5ftecyzw1-sqrewyv">
+      <w:hyperlink w:history="1" r:id="rId8tk3tz0kvif5onfa-bqqn">
         <w:r>
           <w:rPr>
             <w:rStyle w:val="Hyperlink"/>
@@ -5114,7 +5134,7 @@
         </w:rPr>
         <w:t xml:space="preserve"> </w:t>
       </w:r>
-      <w:hyperlink w:history="1" r:id="rIdnfipoj3yagqdmuxnpswxs">
+      <w:hyperlink w:history="1" r:id="rIdwr_ddzpd4v9xsqfxru3co">
         <w:r>
           <w:rPr>
             <w:rStyle w:val="Hyperlink"/>
@@ -5168,7 +5188,7 @@
         </w:rPr>
         <w:t xml:space="preserve"> </w:t>
       </w:r>
-      <w:hyperlink w:history="1" r:id="rIdpwx-qdscgbfatimcdjtok">
+      <w:hyperlink w:history="1" r:id="rIdwfznzxlgofortpl1smteb">
         <w:r>
           <w:rPr>
             <w:rStyle w:val="Hyperlink"/>
@@ -5222,7 +5242,7 @@
         </w:rPr>
         <w:t xml:space="preserve"> </w:t>
       </w:r>
-      <w:hyperlink w:history="1" r:id="rIddcs1-bjm2ugute7bdeuwx">
+      <w:hyperlink w:history="1" r:id="rId_juskxhlhu1jjkxt4vbnc">
         <w:r>
           <w:rPr>
             <w:rStyle w:val="Hyperlink"/>
@@ -5276,7 +5296,7 @@
         </w:rPr>
         <w:t xml:space="preserve"> </w:t>
       </w:r>
-      <w:hyperlink w:history="1" r:id="rIdwarunq_evxo8mf4jwvxmb">
+      <w:hyperlink w:history="1" r:id="rId4uklas79rkcnh12furzo7">
         <w:r>
           <w:rPr>
             <w:rStyle w:val="Hyperlink"/>
@@ -5330,7 +5350,7 @@
         </w:rPr>
         <w:t xml:space="preserve"> </w:t>
       </w:r>
-      <w:hyperlink w:history="1" r:id="rIdn2a8awsclxd8is6nn8ii0">
+      <w:hyperlink w:history="1" r:id="rIdb99tgzgdtmvtcepnwvmzr">
         <w:r>
           <w:rPr>
             <w:rStyle w:val="Hyperlink"/>
@@ -5384,7 +5404,7 @@
         </w:rPr>
         <w:t xml:space="preserve"> </w:t>
       </w:r>
-      <w:hyperlink w:history="1" r:id="rIdz7ol5m0ldbizmlhggnf3-">
+      <w:hyperlink w:history="1" r:id="rIdegafk5zbql2xbkt0zuy4-">
         <w:r>
           <w:rPr>
             <w:rStyle w:val="Hyperlink"/>
@@ -5438,7 +5458,7 @@
         </w:rPr>
         <w:t xml:space="preserve"> </w:t>
       </w:r>
-      <w:hyperlink w:history="1" r:id="rIdazpzzh4ogwsottswo47w_">
+      <w:hyperlink w:history="1" r:id="rIdpjcyapg61ichs2wmdi4nd">
         <w:r>
           <w:rPr>
             <w:rStyle w:val="Hyperlink"/>
@@ -5492,7 +5512,7 @@
         </w:rPr>
         <w:t xml:space="preserve"> </w:t>
       </w:r>
-      <w:hyperlink w:history="1" r:id="rIdcol4j5azhrocxugyvjrm0">
+      <w:hyperlink w:history="1" r:id="rIdo4tic6jghqfg0e2qrcjyy">
         <w:r>
           <w:rPr>
             <w:rStyle w:val="Hyperlink"/>
@@ -5554,7 +5574,7 @@
         </w:rPr>
         <w:t xml:space="preserve"> </w:t>
       </w:r>
-      <w:hyperlink w:history="1" r:id="rIdgw72zku31c7utcjyji_up">
+      <w:hyperlink w:history="1" r:id="rIdhht8qgg0778yqtqq88_sp">
         <w:r>
           <w:rPr>
             <w:rStyle w:val="Hyperlink"/>
@@ -5608,7 +5628,7 @@
         </w:rPr>
         <w:t xml:space="preserve"> </w:t>
       </w:r>
-      <w:hyperlink w:history="1" r:id="rId_nakalagevtihyv8ficyw">
+      <w:hyperlink w:history="1" r:id="rIdib1ohsyieghxyymim7en5">
         <w:r>
           <w:rPr>
             <w:rStyle w:val="Hyperlink"/>
@@ -5662,7 +5682,7 @@
         </w:rPr>
         <w:t xml:space="preserve"> </w:t>
       </w:r>
-      <w:hyperlink w:history="1" r:id="rIdonizocnd23kc_refxdr-_">
+      <w:hyperlink w:history="1" r:id="rIddauwg_lanj7bzcglf8mh5">
         <w:r>
           <w:rPr>
             <w:rStyle w:val="Hyperlink"/>
@@ -5716,7 +5736,7 @@
         </w:rPr>
         <w:t xml:space="preserve"> </w:t>
       </w:r>
-      <w:hyperlink w:history="1" r:id="rId_bpgy8smp_fbk84n3qjuw">
+      <w:hyperlink w:history="1" r:id="rIddwwt6knu4dbr4ajpnyy51">
         <w:r>
           <w:rPr>
             <w:rStyle w:val="Hyperlink"/>
@@ -5770,7 +5790,7 @@
         </w:rPr>
         <w:t xml:space="preserve"> </w:t>
       </w:r>
-      <w:hyperlink w:history="1" r:id="rIdi1ydd5rjio1prqz1tpqad">
+      <w:hyperlink w:history="1" r:id="rIdxx-dpejpkve5sc2or8qvo">
         <w:r>
           <w:rPr>
             <w:rStyle w:val="Hyperlink"/>
@@ -5824,7 +5844,7 @@
         </w:rPr>
         <w:t xml:space="preserve"> </w:t>
       </w:r>
-      <w:hyperlink w:history="1" r:id="rId_2ulc9ql1n1otoifkyqsg">
+      <w:hyperlink w:history="1" r:id="rIdmdi0a3ugrl75zerky1pkp">
         <w:r>
           <w:rPr>
             <w:rStyle w:val="Hyperlink"/>
@@ -5878,7 +5898,7 @@
         </w:rPr>
         <w:t xml:space="preserve"> </w:t>
       </w:r>
-      <w:hyperlink w:history="1" r:id="rIdzdtopv6t6q-sqxm-2zpyr">
+      <w:hyperlink w:history="1" r:id="rIdctwgefjexrn5y5ksznvtc">
         <w:r>
           <w:rPr>
             <w:rStyle w:val="Hyperlink"/>
@@ -5932,7 +5952,7 @@
         </w:rPr>
         <w:t xml:space="preserve"> </w:t>
       </w:r>
-      <w:hyperlink w:history="1" r:id="rId1cwj-f7gdu25jkg9zpz98">
+      <w:hyperlink w:history="1" r:id="rIdgfzyohtyzgzhxiq3alqar">
         <w:r>
           <w:rPr>
             <w:rStyle w:val="Hyperlink"/>
@@ -5986,7 +6006,7 @@
         </w:rPr>
         <w:t xml:space="preserve"> </w:t>
       </w:r>
-      <w:hyperlink w:history="1" r:id="rIdmb92wmcxoouizmy88uvro">
+      <w:hyperlink w:history="1" r:id="rIdp9yrloaz8q_ovn8hnjdtp">
         <w:r>
           <w:rPr>
             <w:rStyle w:val="Hyperlink"/>
@@ -6040,7 +6060,7 @@
         </w:rPr>
         <w:t xml:space="preserve"> </w:t>
       </w:r>
-      <w:hyperlink w:history="1" r:id="rIdf673pkbq8tlygnlgljakd">
+      <w:hyperlink w:history="1" r:id="rIdpkqbdq6zt0someczt6owc">
         <w:r>
           <w:rPr>
             <w:rStyle w:val="Hyperlink"/>
@@ -6094,7 +6114,7 @@
         </w:rPr>
         <w:t xml:space="preserve"> </w:t>
       </w:r>
-      <w:hyperlink w:history="1" r:id="rId6uszo_bi1v-yn25kh7ii4">
+      <w:hyperlink w:history="1" r:id="rIdpygqah70g__nxutlrgpea">
         <w:r>
           <w:rPr>
             <w:rStyle w:val="Hyperlink"/>
@@ -6132,14 +6152,14 @@
           <w:sz w:val="19"/>
           <w:szCs w:val="19"/>
         </w:rPr>
-        <w:t xml:space="preserve">Petites villes de demain : bilan au 31 décembre 2024</w:t>
-      </w:r>
-      <w:r>
-        <w:rPr>
-          <w:sz w:val="19"/>
-          <w:szCs w:val="19"/>
-        </w:rPr>
-        <w:t xml:space="preserve">, 2025.</w:t>
+        <w:t xml:space="preserve">Petites villes de demain : 3 ans d'engagement et 1,1 milliard d'euros investis</w:t>
+      </w:r>
+      <w:r>
+        <w:rPr>
+          <w:sz w:val="19"/>
+          <w:szCs w:val="19"/>
+        </w:rPr>
+        <w:t xml:space="preserve">, 07/06/2023.</w:t>
       </w:r>
       <w:r>
         <w:rPr>
@@ -6148,7 +6168,7 @@
         </w:rPr>
         <w:t xml:space="preserve"> </w:t>
       </w:r>
-      <w:hyperlink w:history="1" r:id="rIdkey5exnah3fxibl01uya9">
+      <w:hyperlink w:history="1" r:id="rId1wxxivp96nl9nxiawchio">
         <w:r>
           <w:rPr>
             <w:rStyle w:val="Hyperlink"/>
@@ -6193,7 +6213,7 @@
           <w:sz w:val="19"/>
           <w:szCs w:val="19"/>
         </w:rPr>
-        <w:t xml:space="preserve">, s.d..</w:t>
+        <w:t xml:space="preserve">, 06/10/2020.</w:t>
       </w:r>
       <w:r>
         <w:rPr>
@@ -6202,7 +6222,7 @@
         </w:rPr>
         <w:t xml:space="preserve"> </w:t>
       </w:r>
-      <w:hyperlink w:history="1" r:id="rIdtoqbxub_trucfsbyqzynt">
+      <w:hyperlink w:history="1" r:id="rIdsbipiewn1u_xzs2ktoofa">
         <w:r>
           <w:rPr>
             <w:rStyle w:val="Hyperlink"/>
@@ -6256,7 +6276,7 @@
         </w:rPr>
         <w:t xml:space="preserve"> </w:t>
       </w:r>
-      <w:hyperlink w:history="1" r:id="rIdhyk71yjvxi2svih65htyu">
+      <w:hyperlink w:history="1" r:id="rIds426guc1gmlurht-r3ztz">
         <w:r>
           <w:rPr>
             <w:rStyle w:val="Hyperlink"/>
@@ -6310,7 +6330,7 @@
         </w:rPr>
         <w:t xml:space="preserve"> </w:t>
       </w:r>
-      <w:hyperlink w:history="1" r:id="rIdr9cyvnzjx0d84istsy_gk">
+      <w:hyperlink w:history="1" r:id="rIdiq8c3fh1jbzqwciqobio6">
         <w:r>
           <w:rPr>
             <w:rStyle w:val="Hyperlink"/>
@@ -6364,7 +6384,7 @@
         </w:rPr>
         <w:t xml:space="preserve"> </w:t>
       </w:r>
-      <w:hyperlink w:history="1" r:id="rIdysjzidk0pazpibpinhes-">
+      <w:hyperlink w:history="1" r:id="rIdejieykudsn8w94rn1inuz">
         <w:r>
           <w:rPr>
             <w:rStyle w:val="Hyperlink"/>
@@ -6426,7 +6446,7 @@
         </w:rPr>
         <w:t xml:space="preserve"> </w:t>
       </w:r>
-      <w:hyperlink w:history="1" r:id="rId077po_0new8mo5xl2xckh">
+      <w:hyperlink w:history="1" r:id="rIdze36u2rnsvfxmybdobet1">
         <w:r>
           <w:rPr>
             <w:rStyle w:val="Hyperlink"/>
@@ -6488,7 +6508,7 @@
         </w:rPr>
         <w:t xml:space="preserve"> </w:t>
       </w:r>
-      <w:hyperlink w:history="1" r:id="rIderfflht9gneuz9m8fmnp7">
+      <w:hyperlink w:history="1" r:id="rIdobe8p8dqcrnzppuysl5jr">
         <w:r>
           <w:rPr>
             <w:rStyle w:val="Hyperlink"/>
@@ -6624,7 +6644,7 @@
         </w:rPr>
         <w:t xml:space="preserve"> </w:t>
       </w:r>
-      <w:hyperlink w:history="1" r:id="rIdlhdjafjscxrbboodcro8i">
+      <w:hyperlink w:history="1" r:id="rIdu1yp9kz-mylw2ngrb5wjo">
         <w:r>
           <w:rPr>
             <w:rStyle w:val="Hyperlink"/>
@@ -6678,7 +6698,7 @@
         </w:rPr>
         <w:t xml:space="preserve"> </w:t>
       </w:r>
-      <w:hyperlink w:history="1" r:id="rIdzgqui9jxxp-kbvopbq36j">
+      <w:hyperlink w:history="1" r:id="rIdszbpngfu8jlesu4jyp4xy">
         <w:r>
           <w:rPr>
             <w:rStyle w:val="Hyperlink"/>
@@ -6762,6 +6782,43 @@
         </w:rPr>
         <w:t xml:space="preserve">, 2026.</w:t>
       </w:r>
+    </w:p>
+    <w:p>
+      <w:pPr>
+        <w:spacing w:after="80"/>
+        <w:ind w:left="360" w:hanging="360"/>
+      </w:pPr>
+      <w:r>
+        <w:rPr>
+          <w:color w:val="595959"/>
+          <w:sz w:val="17"/>
+          <w:szCs w:val="17"/>
+        </w:rPr>
+        <w:t xml:space="preserve">[S16] </w:t>
+      </w:r>
+      <w:r>
+        <w:rPr>
+          <w:sz w:val="19"/>
+          <w:szCs w:val="19"/>
+        </w:rPr>
+        <w:t xml:space="preserve">Codata, </w:t>
+      </w:r>
+      <w:r>
+        <w:rPr>
+          <w:i/>
+          <w:iCs/>
+          <w:sz w:val="19"/>
+          <w:szCs w:val="19"/>
+        </w:rPr>
+        <w:t xml:space="preserve">Quel bilan tirer du plan ACV sur la vacance commerciale des centres-villes de villes moyennes ? (étude Codata / FACT)</w:t>
+      </w:r>
+      <w:r>
+        <w:rPr>
+          <w:sz w:val="19"/>
+          <w:szCs w:val="19"/>
+        </w:rPr>
+        <w:t xml:space="preserve">, s.d. (données 2018-2022).</w:t>
+      </w:r>
       <w:r>
         <w:rPr>
           <w:sz w:val="19"/>
@@ -6769,7 +6826,69 @@
         </w:rPr>
         <w:t xml:space="preserve"> </w:t>
       </w:r>
-      <w:hyperlink w:history="1" r:id="rIdaykr4p_ercfqzrkgcxnzc">
+      <w:hyperlink w:history="1" r:id="rId_6scrhdq_stra06vf-o29">
+        <w:r>
+          <w:rPr>
+            <w:rStyle w:val="Hyperlink"/>
+            <w:sz w:val="17"/>
+            <w:szCs w:val="17"/>
+          </w:rPr>
+          <w:t xml:space="preserve">https://www.codata.eu/blog/quel-bilan-tirer-du-plan-acv-sur-la-vacance-commerciale-des-centres-villes-de-villes-moyennes/</w:t>
+        </w:r>
+      </w:hyperlink>
+    </w:p>
+    <w:p>
+      <w:pPr>
+        <w:pStyle w:val="Heading2"/>
+      </w:pPr>
+      <w:r>
+        <w:t xml:space="preserve">Presse / média spécialisé</w:t>
+      </w:r>
+    </w:p>
+    <w:p>
+      <w:pPr>
+        <w:spacing w:after="80"/>
+        <w:ind w:left="360" w:hanging="360"/>
+      </w:pPr>
+      <w:r>
+        <w:rPr>
+          <w:color w:val="595959"/>
+          <w:sz w:val="17"/>
+          <w:szCs w:val="17"/>
+        </w:rPr>
+        <w:t xml:space="preserve">[S15] </w:t>
+      </w:r>
+      <w:r>
+        <w:rPr>
+          <w:sz w:val="19"/>
+          <w:szCs w:val="19"/>
+        </w:rPr>
+        <w:t xml:space="preserve">L'Échommerces, d'après Codata, </w:t>
+      </w:r>
+      <w:r>
+        <w:rPr>
+          <w:i/>
+          <w:iCs/>
+          <w:sz w:val="19"/>
+          <w:szCs w:val="19"/>
+        </w:rPr>
+        <w:t xml:space="preserve">La vacance commerciale progresse de nouveau en France</w:t>
+      </w:r>
+      <w:r>
+        <w:rPr>
+          <w:sz w:val="19"/>
+          <w:szCs w:val="19"/>
+        </w:rPr>
+        <w:t xml:space="preserve">, 2025.</w:t>
+      </w:r>
+      <w:r>
+        <w:rPr>
+          <w:sz w:val="19"/>
+          <w:szCs w:val="19"/>
+        </w:rPr>
+        <w:t xml:space="preserve"> </w:t>
+      </w:r>
+      <w:hyperlink w:history="1" r:id="rIdpumbstekmt3mbifz7fzir">
         <w:r>
           <w:rPr>
             <w:rStyle w:val="Hyperlink"/>
@@ -6791,14 +6910,14 @@
           <w:sz w:val="17"/>
           <w:szCs w:val="17"/>
         </w:rPr>
-        <w:t xml:space="preserve">[S16] </w:t>
-      </w:r>
-      <w:r>
-        <w:rPr>
-          <w:sz w:val="19"/>
-          <w:szCs w:val="19"/>
-        </w:rPr>
-        <w:t xml:space="preserve">Codata, </w:t>
+        <w:t xml:space="preserve">[S17] </w:t>
+      </w:r>
+      <w:r>
+        <w:rPr>
+          <w:sz w:val="19"/>
+          <w:szCs w:val="19"/>
+        </w:rPr>
+        <w:t xml:space="preserve">Points de Vente, d'après le baromètre Codata / FACT, </w:t>
       </w:r>
       <w:r>
         <w:rPr>
@@ -6807,14 +6926,14 @@
           <w:sz w:val="19"/>
           <w:szCs w:val="19"/>
         </w:rPr>
-        <w:t xml:space="preserve">Quel bilan tirer du plan ACV sur la vacance commerciale des centres-villes de villes moyennes ? (étude Codata / FACT)</w:t>
-      </w:r>
-      <w:r>
-        <w:rPr>
-          <w:sz w:val="19"/>
-          <w:szCs w:val="19"/>
-        </w:rPr>
-        <w:t xml:space="preserve">, s.d. (données 2018-2022).</w:t>
+        <w:t xml:space="preserve">La hausse de la vacance commerciale reprend dans les centres-villes</w:t>
+      </w:r>
+      <w:r>
+        <w:rPr>
+          <w:sz w:val="19"/>
+          <w:szCs w:val="19"/>
+        </w:rPr>
+        <w:t xml:space="preserve">, 23/05/2024.</w:t>
       </w:r>
       <w:r>
         <w:rPr>
@@ -6823,123 +6942,7 @@
         </w:rPr>
         <w:t xml:space="preserve"> </w:t>
       </w:r>
-      <w:hyperlink w:history="1" r:id="rIdraevjmff3fyiin_5xst4q">
-        <w:r>
-          <w:rPr>
-            <w:rStyle w:val="Hyperlink"/>
-            <w:sz w:val="17"/>
-            <w:szCs w:val="17"/>
-          </w:rPr>
-          <w:t xml:space="preserve">https://www.codata.eu/blog/quel-bilan-tirer-du-plan-acv-sur-la-vacance-commerciale-des-centres-villes-de-villes-moyennes/</w:t>
-        </w:r>
-      </w:hyperlink>
-    </w:p>
-    <w:p>
-      <w:pPr>
-        <w:pStyle w:val="Heading2"/>
-      </w:pPr>
-      <w:r>
-        <w:t xml:space="preserve">Presse / média spécialisé</w:t>
-      </w:r>
-    </w:p>
-    <w:p>
-      <w:pPr>
-        <w:spacing w:after="80"/>
-        <w:ind w:left="360" w:hanging="360"/>
-      </w:pPr>
-      <w:r>
-        <w:rPr>
-          <w:color w:val="595959"/>
-          <w:sz w:val="17"/>
-          <w:szCs w:val="17"/>
-        </w:rPr>
-        <w:t xml:space="preserve">[S15] </w:t>
-      </w:r>
-      <w:r>
-        <w:rPr>
-          <w:sz w:val="19"/>
-          <w:szCs w:val="19"/>
-        </w:rPr>
-        <w:t xml:space="preserve">L'Échommerces, d'après Codata, </w:t>
-      </w:r>
-      <w:r>
-        <w:rPr>
-          <w:i/>
-          <w:iCs/>
-          <w:sz w:val="19"/>
-          <w:szCs w:val="19"/>
-        </w:rPr>
-        <w:t xml:space="preserve">La vacance commerciale progresse de nouveau en France</w:t>
-      </w:r>
-      <w:r>
-        <w:rPr>
-          <w:sz w:val="19"/>
-          <w:szCs w:val="19"/>
-        </w:rPr>
-        <w:t xml:space="preserve">, 2025.</w:t>
-      </w:r>
-      <w:r>
-        <w:rPr>
-          <w:sz w:val="19"/>
-          <w:szCs w:val="19"/>
-        </w:rPr>
-        <w:t xml:space="preserve"> </w:t>
-      </w:r>
-      <w:hyperlink w:history="1" r:id="rIdp0ptrxw8x7vzxgsx-ogbm">
-        <w:r>
-          <w:rPr>
-            <w:rStyle w:val="Hyperlink"/>
-            <w:sz w:val="17"/>
-            <w:szCs w:val="17"/>
-          </w:rPr>
-          <w:t xml:space="preserve">https://lechommerces.fr/la-vacance-commerciale-progresse-de-nouveau-en-france/</w:t>
-        </w:r>
-      </w:hyperlink>
-    </w:p>
-    <w:p>
-      <w:pPr>
-        <w:spacing w:after="80"/>
-        <w:ind w:left="360" w:hanging="360"/>
-      </w:pPr>
-      <w:r>
-        <w:rPr>
-          <w:color w:val="595959"/>
-          <w:sz w:val="17"/>
-          <w:szCs w:val="17"/>
-        </w:rPr>
-        <w:t xml:space="preserve">[S17] </w:t>
-      </w:r>
-      <w:r>
-        <w:rPr>
-          <w:sz w:val="19"/>
-          <w:szCs w:val="19"/>
-        </w:rPr>
-        <w:t xml:space="preserve">Points de Vente, d'après le baromètre Codata / FACT, </w:t>
-      </w:r>
-      <w:r>
-        <w:rPr>
-          <w:i/>
-          <w:iCs/>
-          <w:sz w:val="19"/>
-          <w:szCs w:val="19"/>
-        </w:rPr>
-        <w:t xml:space="preserve">La hausse de la vacance commerciale reprend dans les centres-villes</w:t>
-      </w:r>
-      <w:r>
-        <w:rPr>
-          <w:sz w:val="19"/>
-          <w:szCs w:val="19"/>
-        </w:rPr>
-        <w:t xml:space="preserve">, 23/05/2024.</w:t>
-      </w:r>
-      <w:r>
-        <w:rPr>
-          <w:sz w:val="19"/>
-          <w:szCs w:val="19"/>
-        </w:rPr>
-        <w:t xml:space="preserve"> </w:t>
-      </w:r>
-      <w:hyperlink w:history="1" r:id="rId0liyv0hlvfyikjcudvmi3">
+      <w:hyperlink w:history="1" r:id="rId1bcczkmh_k_erh4a1avti">
         <w:r>
           <w:rPr>
             <w:rStyle w:val="Hyperlink"/>
@@ -6993,7 +6996,7 @@
         </w:rPr>
         <w:t xml:space="preserve"> </w:t>
       </w:r>
-      <w:hyperlink w:history="1" r:id="rIdiyl4nkhallpxjo_yxu94q">
+      <w:hyperlink w:history="1" r:id="rIduouunot08nklr4hamechw">
         <w:r>
           <w:rPr>
             <w:rStyle w:val="Hyperlink"/>
@@ -7047,7 +7050,7 @@
         </w:rPr>
         <w:t xml:space="preserve"> </w:t>
       </w:r>
-      <w:hyperlink w:history="1" r:id="rIdyh5gutlqixdxnvez2graa">
+      <w:hyperlink w:history="1" r:id="rIdkj9l7hpqqqaubvpdh5_4h">
         <w:r>
           <w:rPr>
             <w:rStyle w:val="Hyperlink"/>
@@ -7076,7 +7079,7 @@
           <w:sz w:val="19"/>
           <w:szCs w:val="19"/>
         </w:rPr>
-        <w:t xml:space="preserve">Banque des Territoires, </w:t>
+        <w:t xml:space="preserve">Banque des Territoires (Localtis), d'après une étude de la FACT (01/12/2025), </w:t>
       </w:r>
       <w:r>
         <w:rPr>
@@ -7092,7 +7095,7 @@
           <w:sz w:val="19"/>
           <w:szCs w:val="19"/>
         </w:rPr>
-        <w:t xml:space="preserve">, s.d. (données 2020-2022).</w:t>
+        <w:t xml:space="preserve">, 02/12/2025.</w:t>
       </w:r>
       <w:r>
         <w:rPr>
@@ -7101,7 +7104,7 @@
         </w:rPr>
         <w:t xml:space="preserve"> </w:t>
       </w:r>
-      <w:hyperlink w:history="1" r:id="rIdsncau1xmsigxysfpn3ynx">
+      <w:hyperlink w:history="1" r:id="rId3lv-stdycd_6befo5y7fi">
         <w:r>
           <w:rPr>
             <w:rStyle w:val="Hyperlink"/>
@@ -7155,7 +7158,7 @@
         </w:rPr>
         <w:t xml:space="preserve"> </w:t>
       </w:r>
-      <w:hyperlink w:history="1" r:id="rIdljfev1zpm8vwawg7fp6dv">
+      <w:hyperlink w:history="1" r:id="rIdsmsfk4qhan6yr755xpjag">
         <w:r>
           <w:rPr>
             <w:rStyle w:val="Hyperlink"/>
@@ -7209,7 +7212,7 @@
         </w:rPr>
         <w:t xml:space="preserve"> </w:t>
       </w:r>
-      <w:hyperlink w:history="1" r:id="rIdj7xg4r0blnwgok5lrskzu">
+      <w:hyperlink w:history="1" r:id="rIdduto7czlfyrxirri0tivj">
         <w:r>
           <w:rPr>
             <w:rStyle w:val="Hyperlink"/>
@@ -7263,7 +7266,7 @@
         </w:rPr>
         <w:t xml:space="preserve"> </w:t>
       </w:r>
-      <w:hyperlink w:history="1" r:id="rIdykg8whrtn9okdz84tk6ju">
+      <w:hyperlink w:history="1" r:id="rIdp4b-sfvwtsugvw3mcve9c">
         <w:r>
           <w:rPr>
             <w:rStyle w:val="Hyperlink"/>
@@ -7317,7 +7320,7 @@
         </w:rPr>
         <w:t xml:space="preserve"> </w:t>
       </w:r>
-      <w:hyperlink w:history="1" r:id="rIdlnlq4_rte-7dmd1xf7n3p">
+      <w:hyperlink w:history="1" r:id="rIdus7bngk4e9jn3am7cbf5h">
         <w:r>
           <w:rPr>
             <w:rStyle w:val="Hyperlink"/>
@@ -7371,7 +7374,7 @@
         </w:rPr>
         <w:t xml:space="preserve"> </w:t>
       </w:r>
-      <w:hyperlink w:history="1" r:id="rIdannjnoneunvf_rom1oa5q">
+      <w:hyperlink w:history="1" r:id="rIdsqmq7xoiw_iyanpjwsdh0">
         <w:r>
           <w:rPr>
             <w:rStyle w:val="Hyperlink"/>

</xml_diff>